<commit_message>
lista skusDoNome: prioriza substantivo-cabeca ('Leite' nao casa 'Doce de Leite')
</commit_message>
<xml_diff>
--- a/Notas pessoais/Notas.docx
+++ b/Notas pessoais/Notas.docx
@@ -15,6 +15,12 @@
     <w:p>
       <w:r>
         <w:t>Muito bom scanner de documentos</w:t>
+      </w:r>
+    </w:p>
+    <w:p/>
+    <w:p>
+      <w:r>
+        <w:t>https://nutrola.app/en/blog/is-there-an-app-that-recognizes-european-food-barcodes</w:t>
       </w:r>
     </w:p>
     <w:sectPr>

</xml_diff>

<commit_message>
scan p/ lista + alimento vs nao-alimento. (1) CRITICO: scan a partir da Lista (paraLista) ADICIONA a lista (adicionarListaItem c/ ean+nome) em vez de abrir a ficha; sem nome -> identifica por foto e adiciona; ecra de sucesso 'X adicionado a lista' + 'Escanear outro'/'Ver ficha'. (2) EAN nao lido mostra MENSAGEM antes da foto ('nao encontrei pelo codigo, vamos por foto'). (3) Ficha: so mostra Para-Sue/reguas/alternativas/como-avaliamos quando ha nutricao ou Nutri-Score (ehAlimento); senao layout simples (marca/categoria/tamanho + 'nao alimenticio'). v0.0.166.0
</commit_message>
<xml_diff>
--- a/Notas pessoais/Notas.docx
+++ b/Notas pessoais/Notas.docx
@@ -19,10 +19,38 @@
     </w:p>
     <w:p/>
     <w:p>
-      <w:r>
-        <w:t>https://nutrola.app/en/blog/is-there-an-app-that-recognizes-european-food-barcodes</w:t>
-      </w:r>
+      <w:hyperlink r:id="rId4" w:history="1">
+        <w:r>
+          <w:rPr>
+            <w:rStyle w:val="Hyperlink"/>
+          </w:rPr>
+          <w:t>https://nutrola.app/en/blog/is-there-an-app-that-recognizes-european-food-barcodes</w:t>
+        </w:r>
+      </w:hyperlink>
     </w:p>
+    <w:p/>
+    <w:p>
+      <w:hyperlink r:id="rId5" w:history="1">
+        <w:r>
+          <w:rPr>
+            <w:rStyle w:val="Hyperlink"/>
+          </w:rPr>
+          <w:t>https://www.intermarche.pt/product/massa-alimenticia-penne-rigate-embalagem-de-500g/8076802085738</w:t>
+        </w:r>
+      </w:hyperlink>
+    </w:p>
+    <w:p/>
+    <w:p>
+      <w:hyperlink r:id="rId6" w:history="1">
+        <w:r>
+          <w:rPr>
+            <w:rStyle w:val="Hyperlink"/>
+          </w:rPr>
+          <w:t>https://cosmos.bluesoft.com.br/api-pricings</w:t>
+        </w:r>
+      </w:hyperlink>
+    </w:p>
+    <w:p/>
     <w:sectPr>
       <w:pgSz w:w="11906" w:h="16838"/>
       <w:pgMar w:top="1417" w:right="1701" w:bottom="1417" w:left="1701" w:header="708" w:footer="708" w:gutter="0"/>
@@ -949,6 +977,29 @@
       <w:spacing w:val="5"/>
     </w:rPr>
   </w:style>
+  <w:style w:type="character" w:styleId="Hyperlink">
+    <w:name w:val="Hyperlink"/>
+    <w:basedOn w:val="Fontepargpadro"/>
+    <w:uiPriority w:val="99"/>
+    <w:unhideWhenUsed/>
+    <w:rsid w:val="00614047"/>
+    <w:rPr>
+      <w:color w:val="467886" w:themeColor="hyperlink"/>
+      <w:u w:val="single"/>
+    </w:rPr>
+  </w:style>
+  <w:style w:type="character" w:styleId="MenoPendente">
+    <w:name w:val="Unresolved Mention"/>
+    <w:basedOn w:val="Fontepargpadro"/>
+    <w:uiPriority w:val="99"/>
+    <w:semiHidden/>
+    <w:unhideWhenUsed/>
+    <w:rsid w:val="00614047"/>
+    <w:rPr>
+      <w:color w:val="605E5C"/>
+      <w:shd w:val="clear" w:color="auto" w:fill="E1DFDD"/>
+    </w:rPr>
+  </w:style>
 </w:styles>
 </file>
 

</xml_diff>